<commit_message>
updated Ranked / Risked Threat Report (updated 21434 to call out ISO/SAE-ness where they'd been missed)
</commit_message>
<xml_diff>
--- a/source/reference_documents/secondary_documents/design phase/Ranked - Risked Threat Report/Ranked - Risked Threat Report.docx
+++ b/source/reference_documents/secondary_documents/design phase/Ranked - Risked Threat Report/Ranked - Risked Threat Report.docx
@@ -1,6 +1,6 @@
 
 <file path=word/document.xml><?xml version="1.0" encoding="utf-8"?>
-<w:document xmlns:wpc="http://schemas.microsoft.com/office/word/2010/wordprocessingCanvas" xmlns:cx="http://schemas.microsoft.com/office/drawing/2014/chartex" xmlns:cx1="http://schemas.microsoft.com/office/drawing/2015/9/8/chartex" xmlns:cx2="http://schemas.microsoft.com/office/drawing/2015/10/21/chartex" xmlns:cx3="http://schemas.microsoft.com/office/drawing/2016/5/9/chartex" xmlns:cx4="http://schemas.microsoft.com/office/drawing/2016/5/10/chartex" xmlns:cx5="http://schemas.microsoft.com/office/drawing/2016/5/11/chartex" xmlns:cx6="http://schemas.microsoft.com/office/drawing/2016/5/12/chartex" xmlns:cx7="http://schemas.microsoft.com/office/drawing/2016/5/13/chartex" xmlns:cx8="http://schemas.microsoft.com/office/drawing/2016/5/14/chartex" xmlns:mc="http://schemas.openxmlformats.org/markup-compatibility/2006" xmlns:aink="http://schemas.microsoft.com/office/drawing/2016/ink" xmlns:am3d="http://schemas.microsoft.com/office/drawing/2017/model3d" xmlns:o="urn:schemas-microsoft-com:office:office" xmlns:oel="http://schemas.microsoft.com/office/2019/extlst" xmlns:r="http://schemas.openxmlformats.org/officeDocument/2006/relationships" xmlns:m="http://schemas.openxmlformats.org/officeDocument/2006/math" xmlns:v="urn:schemas-microsoft-com:vml" xmlns:wp14="http://schemas.microsoft.com/office/word/2010/wordprocessingDrawing" xmlns:wp="http://schemas.openxmlformats.org/drawingml/2006/wordprocessingDrawing" xmlns:w10="urn:schemas-microsoft-com:office:word" xmlns:w="http://schemas.openxmlformats.org/wordprocessingml/2006/main" xmlns:w14="http://schemas.microsoft.com/office/word/2010/wordml" xmlns:w15="http://schemas.microsoft.com/office/word/2012/wordml" xmlns:w16cex="http://schemas.microsoft.com/office/word/2018/wordml/cex" xmlns:w16cid="http://schemas.microsoft.com/office/word/2016/wordml/cid" xmlns:w16="http://schemas.microsoft.com/office/word/2018/wordml" xmlns:w16sdtdh="http://schemas.microsoft.com/office/word/2020/wordml/sdtdatahash" xmlns:w16se="http://schemas.microsoft.com/office/word/2015/wordml/symex" xmlns:wpg="http://schemas.microsoft.com/office/word/2010/wordprocessingGroup" xmlns:wpi="http://schemas.microsoft.com/office/word/2010/wordprocessingInk" xmlns:wne="http://schemas.microsoft.com/office/word/2006/wordml" xmlns:wps="http://schemas.microsoft.com/office/word/2010/wordprocessingShape" mc:Ignorable="w14 w15 w16se w16cid w16 w16cex w16sdtdh wp14">
+<w:document xmlns:wpc="http://schemas.microsoft.com/office/word/2010/wordprocessingCanvas" xmlns:cx="http://schemas.microsoft.com/office/drawing/2014/chartex" xmlns:cx1="http://schemas.microsoft.com/office/drawing/2015/9/8/chartex" xmlns:cx2="http://schemas.microsoft.com/office/drawing/2015/10/21/chartex" xmlns:cx3="http://schemas.microsoft.com/office/drawing/2016/5/9/chartex" xmlns:cx4="http://schemas.microsoft.com/office/drawing/2016/5/10/chartex" xmlns:cx5="http://schemas.microsoft.com/office/drawing/2016/5/11/chartex" xmlns:cx6="http://schemas.microsoft.com/office/drawing/2016/5/12/chartex" xmlns:cx7="http://schemas.microsoft.com/office/drawing/2016/5/13/chartex" xmlns:cx8="http://schemas.microsoft.com/office/drawing/2016/5/14/chartex" xmlns:mc="http://schemas.openxmlformats.org/markup-compatibility/2006" xmlns:aink="http://schemas.microsoft.com/office/drawing/2016/ink" xmlns:am3d="http://schemas.microsoft.com/office/drawing/2017/model3d" xmlns:o="urn:schemas-microsoft-com:office:office" xmlns:oel="http://schemas.microsoft.com/office/2019/extlst" xmlns:r="http://schemas.openxmlformats.org/officeDocument/2006/relationships" xmlns:m="http://schemas.openxmlformats.org/officeDocument/2006/math" xmlns:v="urn:schemas-microsoft-com:vml" xmlns:wp14="http://schemas.microsoft.com/office/word/2010/wordprocessingDrawing" xmlns:wp="http://schemas.openxmlformats.org/drawingml/2006/wordprocessingDrawing" xmlns:w10="urn:schemas-microsoft-com:office:word" xmlns:w="http://schemas.openxmlformats.org/wordprocessingml/2006/main" xmlns:w14="http://schemas.microsoft.com/office/word/2010/wordml" xmlns:w15="http://schemas.microsoft.com/office/word/2012/wordml" xmlns:w16cex="http://schemas.microsoft.com/office/word/2018/wordml/cex" xmlns:w16cid="http://schemas.microsoft.com/office/word/2016/wordml/cid" xmlns:w16="http://schemas.microsoft.com/office/word/2018/wordml" xmlns:w16du="http://schemas.microsoft.com/office/word/2023/wordml/word16du" xmlns:w16sdtdh="http://schemas.microsoft.com/office/word/2020/wordml/sdtdatahash" xmlns:w16sdtfl="http://schemas.microsoft.com/office/word/2024/wordml/sdtformatlock" xmlns:w16se="http://schemas.microsoft.com/office/word/2015/wordml/symex" xmlns:wpg="http://schemas.microsoft.com/office/word/2010/wordprocessingGroup" xmlns:wpi="http://schemas.microsoft.com/office/word/2010/wordprocessingInk" xmlns:wne="http://schemas.microsoft.com/office/word/2006/wordml" xmlns:wps="http://schemas.microsoft.com/office/word/2010/wordprocessingShape" mc:Ignorable="w14 w15 w16se w16cid w16 w16cex w16sdtdh w16sdtfl w16du wp14">
   <w:body>
     <w:p>
       <w:pPr>
@@ -26,7 +26,7 @@
         <w:t xml:space="preserve">Version </w:t>
       </w:r>
       <w:r>
-        <w:t>7</w:t>
+        <w:t>8</w:t>
       </w:r>
     </w:p>
     <w:p>
@@ -43,7 +43,7 @@
         <w:rPr>
           <w:noProof/>
         </w:rPr>
-        <w:t>9/8/23 11:38 AM</w:t>
+        <w:t>6/16/25 2:46 PM</w:t>
       </w:r>
       <w:r>
         <w:fldChar w:fldCharType="end"/>
@@ -275,7 +275,19 @@
         <w:rPr>
           <w:lang w:val="en-US"/>
         </w:rPr>
-        <w:t xml:space="preserve">was created by </w:t>
+        <w:t xml:space="preserve">was </w:t>
+      </w:r>
+      <w:r>
+        <w:rPr>
+          <w:lang w:val="en-US"/>
+        </w:rPr>
+        <w:t xml:space="preserve">originally </w:t>
+      </w:r>
+      <w:r>
+        <w:rPr>
+          <w:lang w:val="en-US"/>
+        </w:rPr>
+        <w:t xml:space="preserve">created by </w:t>
       </w:r>
       <w:r>
         <w:rPr>
@@ -412,10 +424,10 @@
           <w:noProof/>
         </w:rPr>
         <w:drawing>
-          <wp:inline distT="0" distB="0" distL="0" distR="0" wp14:anchorId="6BCF4EE1" wp14:editId="4BFA0F97">
-            <wp:extent cx="5943600" cy="3738880"/>
+          <wp:inline distT="0" distB="0" distL="0" distR="0" wp14:anchorId="6BCF4EE1" wp14:editId="4F7285D3">
+            <wp:extent cx="5943600" cy="3735977"/>
             <wp:effectExtent l="0" t="0" r="0" b="0"/>
-            <wp:docPr id="1" name="Picture 1" descr="Diagram&#10;&#10;Description automatically generated"/>
+            <wp:docPr id="1" name="Picture 1"/>
             <wp:cNvGraphicFramePr>
               <a:graphicFrameLocks xmlns:a="http://schemas.openxmlformats.org/drawingml/2006/main" noChangeAspect="1"/>
             </wp:cNvGraphicFramePr>
@@ -423,11 +435,11 @@
               <a:graphicData uri="http://schemas.openxmlformats.org/drawingml/2006/picture">
                 <pic:pic xmlns:pic="http://schemas.openxmlformats.org/drawingml/2006/picture">
                   <pic:nvPicPr>
-                    <pic:cNvPr id="1" name="Picture 1" descr="Diagram&#10;&#10;Description automatically generated"/>
+                    <pic:cNvPr id="1" name="Picture 1"/>
                     <pic:cNvPicPr/>
                   </pic:nvPicPr>
                   <pic:blipFill>
-                    <a:blip r:embed="rId8">
+                    <a:blip r:embed="rId8" cstate="print">
                       <a:extLst>
                         <a:ext uri="{28A0092B-C50C-407E-A947-70E740481C1C}">
                           <a14:useLocalDpi xmlns:a14="http://schemas.microsoft.com/office/drawing/2010/main" val="0"/>
@@ -441,7 +453,7 @@
                   <pic:spPr>
                     <a:xfrm>
                       <a:off x="0" y="0"/>
-                      <a:ext cx="5943600" cy="3738880"/>
+                      <a:ext cx="5943600" cy="3735977"/>
                     </a:xfrm>
                     <a:prstGeom prst="rect">
                       <a:avLst/>
@@ -941,7 +953,13 @@
         <w:t>value</w:t>
       </w:r>
       <w:r>
-        <w:t xml:space="preserve"> (ISO 21434</w:t>
+        <w:t xml:space="preserve"> (ISO</w:t>
+      </w:r>
+      <w:r>
+        <w:t>/SAE</w:t>
+      </w:r>
+      <w:r>
+        <w:t xml:space="preserve"> 21434</w:t>
       </w:r>
       <w:r>
         <w:t xml:space="preserve"> RQ-15-10: [</w:t>
@@ -1069,7 +1087,13 @@
         <w:jc w:val="both"/>
       </w:pPr>
       <w:r>
-        <w:t>Quantized value (ISO 21434 RQ-15-16: [</w:t>
+        <w:t>Quantized value (ISO</w:t>
+      </w:r>
+      <w:r>
+        <w:t>/SAE</w:t>
+      </w:r>
+      <w:r>
+        <w:t xml:space="preserve"> 21434 RQ-15-16: [</w:t>
       </w:r>
       <w:r>
         <w:rPr>
@@ -1211,7 +1235,21 @@
           <w:b/>
           <w:bCs/>
         </w:rPr>
-        <w:t>ISO 21434</w:t>
+        <w:t>ISO</w:t>
+      </w:r>
+      <w:r>
+        <w:rPr>
+          <w:b/>
+          <w:bCs/>
+        </w:rPr>
+        <w:t>/SAE</w:t>
+      </w:r>
+      <w:r>
+        <w:rPr>
+          <w:b/>
+          <w:bCs/>
+        </w:rPr>
+        <w:t xml:space="preserve"> 21434</w:t>
       </w:r>
       <w:r>
         <w:t xml:space="preserve"> as follows:</w:t>
@@ -1724,7 +1762,7 @@
 </file>
 
 <file path=word/endnotes.xml><?xml version="1.0" encoding="utf-8"?>
-<w:endnotes xmlns:wpc="http://schemas.microsoft.com/office/word/2010/wordprocessingCanvas" xmlns:cx="http://schemas.microsoft.com/office/drawing/2014/chartex" xmlns:cx1="http://schemas.microsoft.com/office/drawing/2015/9/8/chartex" xmlns:cx2="http://schemas.microsoft.com/office/drawing/2015/10/21/chartex" xmlns:cx3="http://schemas.microsoft.com/office/drawing/2016/5/9/chartex" xmlns:cx4="http://schemas.microsoft.com/office/drawing/2016/5/10/chartex" xmlns:cx5="http://schemas.microsoft.com/office/drawing/2016/5/11/chartex" xmlns:cx6="http://schemas.microsoft.com/office/drawing/2016/5/12/chartex" xmlns:cx7="http://schemas.microsoft.com/office/drawing/2016/5/13/chartex" xmlns:cx8="http://schemas.microsoft.com/office/drawing/2016/5/14/chartex" xmlns:mc="http://schemas.openxmlformats.org/markup-compatibility/2006" xmlns:aink="http://schemas.microsoft.com/office/drawing/2016/ink" xmlns:am3d="http://schemas.microsoft.com/office/drawing/2017/model3d" xmlns:o="urn:schemas-microsoft-com:office:office" xmlns:oel="http://schemas.microsoft.com/office/2019/extlst" xmlns:r="http://schemas.openxmlformats.org/officeDocument/2006/relationships" xmlns:m="http://schemas.openxmlformats.org/officeDocument/2006/math" xmlns:v="urn:schemas-microsoft-com:vml" xmlns:wp14="http://schemas.microsoft.com/office/word/2010/wordprocessingDrawing" xmlns:wp="http://schemas.openxmlformats.org/drawingml/2006/wordprocessingDrawing" xmlns:w10="urn:schemas-microsoft-com:office:word" xmlns:w="http://schemas.openxmlformats.org/wordprocessingml/2006/main" xmlns:w14="http://schemas.microsoft.com/office/word/2010/wordml" xmlns:w15="http://schemas.microsoft.com/office/word/2012/wordml" xmlns:w16cex="http://schemas.microsoft.com/office/word/2018/wordml/cex" xmlns:w16cid="http://schemas.microsoft.com/office/word/2016/wordml/cid" xmlns:w16="http://schemas.microsoft.com/office/word/2018/wordml" xmlns:w16sdtdh="http://schemas.microsoft.com/office/word/2020/wordml/sdtdatahash" xmlns:w16se="http://schemas.microsoft.com/office/word/2015/wordml/symex" xmlns:wpg="http://schemas.microsoft.com/office/word/2010/wordprocessingGroup" xmlns:wpi="http://schemas.microsoft.com/office/word/2010/wordprocessingInk" xmlns:wne="http://schemas.microsoft.com/office/word/2006/wordml" xmlns:wps="http://schemas.microsoft.com/office/word/2010/wordprocessingShape" mc:Ignorable="w14 w15 w16se w16cid w16 w16cex w16sdtdh wp14">
+<w:endnotes xmlns:wpc="http://schemas.microsoft.com/office/word/2010/wordprocessingCanvas" xmlns:cx="http://schemas.microsoft.com/office/drawing/2014/chartex" xmlns:cx1="http://schemas.microsoft.com/office/drawing/2015/9/8/chartex" xmlns:cx2="http://schemas.microsoft.com/office/drawing/2015/10/21/chartex" xmlns:cx3="http://schemas.microsoft.com/office/drawing/2016/5/9/chartex" xmlns:cx4="http://schemas.microsoft.com/office/drawing/2016/5/10/chartex" xmlns:cx5="http://schemas.microsoft.com/office/drawing/2016/5/11/chartex" xmlns:cx6="http://schemas.microsoft.com/office/drawing/2016/5/12/chartex" xmlns:cx7="http://schemas.microsoft.com/office/drawing/2016/5/13/chartex" xmlns:cx8="http://schemas.microsoft.com/office/drawing/2016/5/14/chartex" xmlns:mc="http://schemas.openxmlformats.org/markup-compatibility/2006" xmlns:aink="http://schemas.microsoft.com/office/drawing/2016/ink" xmlns:am3d="http://schemas.microsoft.com/office/drawing/2017/model3d" xmlns:o="urn:schemas-microsoft-com:office:office" xmlns:oel="http://schemas.microsoft.com/office/2019/extlst" xmlns:r="http://schemas.openxmlformats.org/officeDocument/2006/relationships" xmlns:m="http://schemas.openxmlformats.org/officeDocument/2006/math" xmlns:v="urn:schemas-microsoft-com:vml" xmlns:wp14="http://schemas.microsoft.com/office/word/2010/wordprocessingDrawing" xmlns:wp="http://schemas.openxmlformats.org/drawingml/2006/wordprocessingDrawing" xmlns:w10="urn:schemas-microsoft-com:office:word" xmlns:w="http://schemas.openxmlformats.org/wordprocessingml/2006/main" xmlns:w14="http://schemas.microsoft.com/office/word/2010/wordml" xmlns:w15="http://schemas.microsoft.com/office/word/2012/wordml" xmlns:w16cex="http://schemas.microsoft.com/office/word/2018/wordml/cex" xmlns:w16cid="http://schemas.microsoft.com/office/word/2016/wordml/cid" xmlns:w16="http://schemas.microsoft.com/office/word/2018/wordml" xmlns:w16du="http://schemas.microsoft.com/office/word/2023/wordml/word16du" xmlns:w16sdtdh="http://schemas.microsoft.com/office/word/2020/wordml/sdtdatahash" xmlns:w16sdtfl="http://schemas.microsoft.com/office/word/2024/wordml/sdtformatlock" xmlns:w16se="http://schemas.microsoft.com/office/word/2015/wordml/symex" xmlns:wpg="http://schemas.microsoft.com/office/word/2010/wordprocessingGroup" xmlns:wpi="http://schemas.microsoft.com/office/word/2010/wordprocessingInk" xmlns:wne="http://schemas.microsoft.com/office/word/2006/wordml" xmlns:wps="http://schemas.microsoft.com/office/word/2010/wordprocessingShape" mc:Ignorable="w14 w15 w16se w16cid w16 w16cex w16sdtdh w16sdtfl w16du wp14">
   <w:endnote w:type="separator" w:id="-1">
     <w:p>
       <w:pPr>
@@ -1749,7 +1787,7 @@
 </file>
 
 <file path=word/footer1.xml><?xml version="1.0" encoding="utf-8"?>
-<w:ftr xmlns:wpc="http://schemas.microsoft.com/office/word/2010/wordprocessingCanvas" xmlns:cx="http://schemas.microsoft.com/office/drawing/2014/chartex" xmlns:cx1="http://schemas.microsoft.com/office/drawing/2015/9/8/chartex" xmlns:cx2="http://schemas.microsoft.com/office/drawing/2015/10/21/chartex" xmlns:cx3="http://schemas.microsoft.com/office/drawing/2016/5/9/chartex" xmlns:cx4="http://schemas.microsoft.com/office/drawing/2016/5/10/chartex" xmlns:cx5="http://schemas.microsoft.com/office/drawing/2016/5/11/chartex" xmlns:cx6="http://schemas.microsoft.com/office/drawing/2016/5/12/chartex" xmlns:cx7="http://schemas.microsoft.com/office/drawing/2016/5/13/chartex" xmlns:cx8="http://schemas.microsoft.com/office/drawing/2016/5/14/chartex" xmlns:mc="http://schemas.openxmlformats.org/markup-compatibility/2006" xmlns:aink="http://schemas.microsoft.com/office/drawing/2016/ink" xmlns:am3d="http://schemas.microsoft.com/office/drawing/2017/model3d" xmlns:o="urn:schemas-microsoft-com:office:office" xmlns:oel="http://schemas.microsoft.com/office/2019/extlst" xmlns:r="http://schemas.openxmlformats.org/officeDocument/2006/relationships" xmlns:m="http://schemas.openxmlformats.org/officeDocument/2006/math" xmlns:v="urn:schemas-microsoft-com:vml" xmlns:wp14="http://schemas.microsoft.com/office/word/2010/wordprocessingDrawing" xmlns:wp="http://schemas.openxmlformats.org/drawingml/2006/wordprocessingDrawing" xmlns:w10="urn:schemas-microsoft-com:office:word" xmlns:w="http://schemas.openxmlformats.org/wordprocessingml/2006/main" xmlns:w14="http://schemas.microsoft.com/office/word/2010/wordml" xmlns:w15="http://schemas.microsoft.com/office/word/2012/wordml" xmlns:w16cex="http://schemas.microsoft.com/office/word/2018/wordml/cex" xmlns:w16cid="http://schemas.microsoft.com/office/word/2016/wordml/cid" xmlns:w16="http://schemas.microsoft.com/office/word/2018/wordml" xmlns:w16sdtdh="http://schemas.microsoft.com/office/word/2020/wordml/sdtdatahash" xmlns:w16se="http://schemas.microsoft.com/office/word/2015/wordml/symex" xmlns:wpg="http://schemas.microsoft.com/office/word/2010/wordprocessingGroup" xmlns:wpi="http://schemas.microsoft.com/office/word/2010/wordprocessingInk" xmlns:wne="http://schemas.microsoft.com/office/word/2006/wordml" xmlns:wps="http://schemas.microsoft.com/office/word/2010/wordprocessingShape" mc:Ignorable="w14 w15 w16se w16cid w16 w16cex w16sdtdh wp14">
+<w:ftr xmlns:wpc="http://schemas.microsoft.com/office/word/2010/wordprocessingCanvas" xmlns:cx="http://schemas.microsoft.com/office/drawing/2014/chartex" xmlns:cx1="http://schemas.microsoft.com/office/drawing/2015/9/8/chartex" xmlns:cx2="http://schemas.microsoft.com/office/drawing/2015/10/21/chartex" xmlns:cx3="http://schemas.microsoft.com/office/drawing/2016/5/9/chartex" xmlns:cx4="http://schemas.microsoft.com/office/drawing/2016/5/10/chartex" xmlns:cx5="http://schemas.microsoft.com/office/drawing/2016/5/11/chartex" xmlns:cx6="http://schemas.microsoft.com/office/drawing/2016/5/12/chartex" xmlns:cx7="http://schemas.microsoft.com/office/drawing/2016/5/13/chartex" xmlns:cx8="http://schemas.microsoft.com/office/drawing/2016/5/14/chartex" xmlns:mc="http://schemas.openxmlformats.org/markup-compatibility/2006" xmlns:aink="http://schemas.microsoft.com/office/drawing/2016/ink" xmlns:am3d="http://schemas.microsoft.com/office/drawing/2017/model3d" xmlns:o="urn:schemas-microsoft-com:office:office" xmlns:oel="http://schemas.microsoft.com/office/2019/extlst" xmlns:r="http://schemas.openxmlformats.org/officeDocument/2006/relationships" xmlns:m="http://schemas.openxmlformats.org/officeDocument/2006/math" xmlns:v="urn:schemas-microsoft-com:vml" xmlns:wp14="http://schemas.microsoft.com/office/word/2010/wordprocessingDrawing" xmlns:wp="http://schemas.openxmlformats.org/drawingml/2006/wordprocessingDrawing" xmlns:w10="urn:schemas-microsoft-com:office:word" xmlns:w="http://schemas.openxmlformats.org/wordprocessingml/2006/main" xmlns:w14="http://schemas.microsoft.com/office/word/2010/wordml" xmlns:w15="http://schemas.microsoft.com/office/word/2012/wordml" xmlns:w16cex="http://schemas.microsoft.com/office/word/2018/wordml/cex" xmlns:w16cid="http://schemas.microsoft.com/office/word/2016/wordml/cid" xmlns:w16="http://schemas.microsoft.com/office/word/2018/wordml" xmlns:w16du="http://schemas.microsoft.com/office/word/2023/wordml/word16du" xmlns:w16sdtdh="http://schemas.microsoft.com/office/word/2020/wordml/sdtdatahash" xmlns:w16sdtfl="http://schemas.microsoft.com/office/word/2024/wordml/sdtformatlock" xmlns:w16se="http://schemas.microsoft.com/office/word/2015/wordml/symex" xmlns:wpg="http://schemas.microsoft.com/office/word/2010/wordprocessingGroup" xmlns:wpi="http://schemas.microsoft.com/office/word/2010/wordprocessingInk" xmlns:wne="http://schemas.microsoft.com/office/word/2006/wordml" xmlns:wps="http://schemas.microsoft.com/office/word/2010/wordprocessingShape" mc:Ignorable="w14 w15 w16se w16cid w16 w16cex w16sdtdh w16sdtfl w16du wp14">
   <w:sdt>
     <w:sdtPr>
       <w:rPr>
@@ -1801,7 +1839,7 @@
 </file>
 
 <file path=word/footer2.xml><?xml version="1.0" encoding="utf-8"?>
-<w:ftr xmlns:wpc="http://schemas.microsoft.com/office/word/2010/wordprocessingCanvas" xmlns:cx="http://schemas.microsoft.com/office/drawing/2014/chartex" xmlns:cx1="http://schemas.microsoft.com/office/drawing/2015/9/8/chartex" xmlns:cx2="http://schemas.microsoft.com/office/drawing/2015/10/21/chartex" xmlns:cx3="http://schemas.microsoft.com/office/drawing/2016/5/9/chartex" xmlns:cx4="http://schemas.microsoft.com/office/drawing/2016/5/10/chartex" xmlns:cx5="http://schemas.microsoft.com/office/drawing/2016/5/11/chartex" xmlns:cx6="http://schemas.microsoft.com/office/drawing/2016/5/12/chartex" xmlns:cx7="http://schemas.microsoft.com/office/drawing/2016/5/13/chartex" xmlns:cx8="http://schemas.microsoft.com/office/drawing/2016/5/14/chartex" xmlns:mc="http://schemas.openxmlformats.org/markup-compatibility/2006" xmlns:aink="http://schemas.microsoft.com/office/drawing/2016/ink" xmlns:am3d="http://schemas.microsoft.com/office/drawing/2017/model3d" xmlns:o="urn:schemas-microsoft-com:office:office" xmlns:oel="http://schemas.microsoft.com/office/2019/extlst" xmlns:r="http://schemas.openxmlformats.org/officeDocument/2006/relationships" xmlns:m="http://schemas.openxmlformats.org/officeDocument/2006/math" xmlns:v="urn:schemas-microsoft-com:vml" xmlns:wp14="http://schemas.microsoft.com/office/word/2010/wordprocessingDrawing" xmlns:wp="http://schemas.openxmlformats.org/drawingml/2006/wordprocessingDrawing" xmlns:w10="urn:schemas-microsoft-com:office:word" xmlns:w="http://schemas.openxmlformats.org/wordprocessingml/2006/main" xmlns:w14="http://schemas.microsoft.com/office/word/2010/wordml" xmlns:w15="http://schemas.microsoft.com/office/word/2012/wordml" xmlns:w16cex="http://schemas.microsoft.com/office/word/2018/wordml/cex" xmlns:w16cid="http://schemas.microsoft.com/office/word/2016/wordml/cid" xmlns:w16="http://schemas.microsoft.com/office/word/2018/wordml" xmlns:w16sdtdh="http://schemas.microsoft.com/office/word/2020/wordml/sdtdatahash" xmlns:w16se="http://schemas.microsoft.com/office/word/2015/wordml/symex" xmlns:wpg="http://schemas.microsoft.com/office/word/2010/wordprocessingGroup" xmlns:wpi="http://schemas.microsoft.com/office/word/2010/wordprocessingInk" xmlns:wne="http://schemas.microsoft.com/office/word/2006/wordml" xmlns:wps="http://schemas.microsoft.com/office/word/2010/wordprocessingShape" mc:Ignorable="w14 w15 w16se w16cid w16 w16cex w16sdtdh wp14">
+<w:ftr xmlns:wpc="http://schemas.microsoft.com/office/word/2010/wordprocessingCanvas" xmlns:cx="http://schemas.microsoft.com/office/drawing/2014/chartex" xmlns:cx1="http://schemas.microsoft.com/office/drawing/2015/9/8/chartex" xmlns:cx2="http://schemas.microsoft.com/office/drawing/2015/10/21/chartex" xmlns:cx3="http://schemas.microsoft.com/office/drawing/2016/5/9/chartex" xmlns:cx4="http://schemas.microsoft.com/office/drawing/2016/5/10/chartex" xmlns:cx5="http://schemas.microsoft.com/office/drawing/2016/5/11/chartex" xmlns:cx6="http://schemas.microsoft.com/office/drawing/2016/5/12/chartex" xmlns:cx7="http://schemas.microsoft.com/office/drawing/2016/5/13/chartex" xmlns:cx8="http://schemas.microsoft.com/office/drawing/2016/5/14/chartex" xmlns:mc="http://schemas.openxmlformats.org/markup-compatibility/2006" xmlns:aink="http://schemas.microsoft.com/office/drawing/2016/ink" xmlns:am3d="http://schemas.microsoft.com/office/drawing/2017/model3d" xmlns:o="urn:schemas-microsoft-com:office:office" xmlns:oel="http://schemas.microsoft.com/office/2019/extlst" xmlns:r="http://schemas.openxmlformats.org/officeDocument/2006/relationships" xmlns:m="http://schemas.openxmlformats.org/officeDocument/2006/math" xmlns:v="urn:schemas-microsoft-com:vml" xmlns:wp14="http://schemas.microsoft.com/office/word/2010/wordprocessingDrawing" xmlns:wp="http://schemas.openxmlformats.org/drawingml/2006/wordprocessingDrawing" xmlns:w10="urn:schemas-microsoft-com:office:word" xmlns:w="http://schemas.openxmlformats.org/wordprocessingml/2006/main" xmlns:w14="http://schemas.microsoft.com/office/word/2010/wordml" xmlns:w15="http://schemas.microsoft.com/office/word/2012/wordml" xmlns:w16cex="http://schemas.microsoft.com/office/word/2018/wordml/cex" xmlns:w16cid="http://schemas.microsoft.com/office/word/2016/wordml/cid" xmlns:w16="http://schemas.microsoft.com/office/word/2018/wordml" xmlns:w16du="http://schemas.microsoft.com/office/word/2023/wordml/word16du" xmlns:w16sdtdh="http://schemas.microsoft.com/office/word/2020/wordml/sdtdatahash" xmlns:w16sdtfl="http://schemas.microsoft.com/office/word/2024/wordml/sdtformatlock" xmlns:w16se="http://schemas.microsoft.com/office/word/2015/wordml/symex" xmlns:wpg="http://schemas.microsoft.com/office/word/2010/wordprocessingGroup" xmlns:wpi="http://schemas.microsoft.com/office/word/2010/wordprocessingInk" xmlns:wne="http://schemas.microsoft.com/office/word/2006/wordml" xmlns:wps="http://schemas.microsoft.com/office/word/2010/wordprocessingShape" mc:Ignorable="w14 w15 w16se w16cid w16 w16cex w16sdtdh w16sdtfl w16du wp14">
   <w:sdt>
     <w:sdtPr>
       <w:rPr>
@@ -1866,7 +1904,7 @@
 </file>
 
 <file path=word/footnotes.xml><?xml version="1.0" encoding="utf-8"?>
-<w:footnotes xmlns:wpc="http://schemas.microsoft.com/office/word/2010/wordprocessingCanvas" xmlns:cx="http://schemas.microsoft.com/office/drawing/2014/chartex" xmlns:cx1="http://schemas.microsoft.com/office/drawing/2015/9/8/chartex" xmlns:cx2="http://schemas.microsoft.com/office/drawing/2015/10/21/chartex" xmlns:cx3="http://schemas.microsoft.com/office/drawing/2016/5/9/chartex" xmlns:cx4="http://schemas.microsoft.com/office/drawing/2016/5/10/chartex" xmlns:cx5="http://schemas.microsoft.com/office/drawing/2016/5/11/chartex" xmlns:cx6="http://schemas.microsoft.com/office/drawing/2016/5/12/chartex" xmlns:cx7="http://schemas.microsoft.com/office/drawing/2016/5/13/chartex" xmlns:cx8="http://schemas.microsoft.com/office/drawing/2016/5/14/chartex" xmlns:mc="http://schemas.openxmlformats.org/markup-compatibility/2006" xmlns:aink="http://schemas.microsoft.com/office/drawing/2016/ink" xmlns:am3d="http://schemas.microsoft.com/office/drawing/2017/model3d" xmlns:o="urn:schemas-microsoft-com:office:office" xmlns:oel="http://schemas.microsoft.com/office/2019/extlst" xmlns:r="http://schemas.openxmlformats.org/officeDocument/2006/relationships" xmlns:m="http://schemas.openxmlformats.org/officeDocument/2006/math" xmlns:v="urn:schemas-microsoft-com:vml" xmlns:wp14="http://schemas.microsoft.com/office/word/2010/wordprocessingDrawing" xmlns:wp="http://schemas.openxmlformats.org/drawingml/2006/wordprocessingDrawing" xmlns:w10="urn:schemas-microsoft-com:office:word" xmlns:w="http://schemas.openxmlformats.org/wordprocessingml/2006/main" xmlns:w14="http://schemas.microsoft.com/office/word/2010/wordml" xmlns:w15="http://schemas.microsoft.com/office/word/2012/wordml" xmlns:w16cex="http://schemas.microsoft.com/office/word/2018/wordml/cex" xmlns:w16cid="http://schemas.microsoft.com/office/word/2016/wordml/cid" xmlns:w16="http://schemas.microsoft.com/office/word/2018/wordml" xmlns:w16sdtdh="http://schemas.microsoft.com/office/word/2020/wordml/sdtdatahash" xmlns:w16se="http://schemas.microsoft.com/office/word/2015/wordml/symex" xmlns:wpg="http://schemas.microsoft.com/office/word/2010/wordprocessingGroup" xmlns:wpi="http://schemas.microsoft.com/office/word/2010/wordprocessingInk" xmlns:wne="http://schemas.microsoft.com/office/word/2006/wordml" xmlns:wps="http://schemas.microsoft.com/office/word/2010/wordprocessingShape" mc:Ignorable="w14 w15 w16se w16cid w16 w16cex w16sdtdh wp14">
+<w:footnotes xmlns:wpc="http://schemas.microsoft.com/office/word/2010/wordprocessingCanvas" xmlns:cx="http://schemas.microsoft.com/office/drawing/2014/chartex" xmlns:cx1="http://schemas.microsoft.com/office/drawing/2015/9/8/chartex" xmlns:cx2="http://schemas.microsoft.com/office/drawing/2015/10/21/chartex" xmlns:cx3="http://schemas.microsoft.com/office/drawing/2016/5/9/chartex" xmlns:cx4="http://schemas.microsoft.com/office/drawing/2016/5/10/chartex" xmlns:cx5="http://schemas.microsoft.com/office/drawing/2016/5/11/chartex" xmlns:cx6="http://schemas.microsoft.com/office/drawing/2016/5/12/chartex" xmlns:cx7="http://schemas.microsoft.com/office/drawing/2016/5/13/chartex" xmlns:cx8="http://schemas.microsoft.com/office/drawing/2016/5/14/chartex" xmlns:mc="http://schemas.openxmlformats.org/markup-compatibility/2006" xmlns:aink="http://schemas.microsoft.com/office/drawing/2016/ink" xmlns:am3d="http://schemas.microsoft.com/office/drawing/2017/model3d" xmlns:o="urn:schemas-microsoft-com:office:office" xmlns:oel="http://schemas.microsoft.com/office/2019/extlst" xmlns:r="http://schemas.openxmlformats.org/officeDocument/2006/relationships" xmlns:m="http://schemas.openxmlformats.org/officeDocument/2006/math" xmlns:v="urn:schemas-microsoft-com:vml" xmlns:wp14="http://schemas.microsoft.com/office/word/2010/wordprocessingDrawing" xmlns:wp="http://schemas.openxmlformats.org/drawingml/2006/wordprocessingDrawing" xmlns:w10="urn:schemas-microsoft-com:office:word" xmlns:w="http://schemas.openxmlformats.org/wordprocessingml/2006/main" xmlns:w14="http://schemas.microsoft.com/office/word/2010/wordml" xmlns:w15="http://schemas.microsoft.com/office/word/2012/wordml" xmlns:w16cex="http://schemas.microsoft.com/office/word/2018/wordml/cex" xmlns:w16cid="http://schemas.microsoft.com/office/word/2016/wordml/cid" xmlns:w16="http://schemas.microsoft.com/office/word/2018/wordml" xmlns:w16du="http://schemas.microsoft.com/office/word/2023/wordml/word16du" xmlns:w16sdtdh="http://schemas.microsoft.com/office/word/2020/wordml/sdtdatahash" xmlns:w16sdtfl="http://schemas.microsoft.com/office/word/2024/wordml/sdtformatlock" xmlns:w16se="http://schemas.microsoft.com/office/word/2015/wordml/symex" xmlns:wpg="http://schemas.microsoft.com/office/word/2010/wordprocessingGroup" xmlns:wpi="http://schemas.microsoft.com/office/word/2010/wordprocessingInk" xmlns:wne="http://schemas.microsoft.com/office/word/2006/wordml" xmlns:wps="http://schemas.microsoft.com/office/word/2010/wordprocessingShape" mc:Ignorable="w14 w15 w16se w16cid w16 w16cex w16sdtdh w16sdtfl w16du wp14">
   <w:footnote w:type="separator" w:id="-1">
     <w:p>
       <w:pPr>
@@ -1891,7 +1929,7 @@
 </file>
 
 <file path=word/header1.xml><?xml version="1.0" encoding="utf-8"?>
-<w:hdr xmlns:wpc="http://schemas.microsoft.com/office/word/2010/wordprocessingCanvas" xmlns:cx="http://schemas.microsoft.com/office/drawing/2014/chartex" xmlns:cx1="http://schemas.microsoft.com/office/drawing/2015/9/8/chartex" xmlns:cx2="http://schemas.microsoft.com/office/drawing/2015/10/21/chartex" xmlns:cx3="http://schemas.microsoft.com/office/drawing/2016/5/9/chartex" xmlns:cx4="http://schemas.microsoft.com/office/drawing/2016/5/10/chartex" xmlns:cx5="http://schemas.microsoft.com/office/drawing/2016/5/11/chartex" xmlns:cx6="http://schemas.microsoft.com/office/drawing/2016/5/12/chartex" xmlns:cx7="http://schemas.microsoft.com/office/drawing/2016/5/13/chartex" xmlns:cx8="http://schemas.microsoft.com/office/drawing/2016/5/14/chartex" xmlns:mc="http://schemas.openxmlformats.org/markup-compatibility/2006" xmlns:aink="http://schemas.microsoft.com/office/drawing/2016/ink" xmlns:am3d="http://schemas.microsoft.com/office/drawing/2017/model3d" xmlns:o="urn:schemas-microsoft-com:office:office" xmlns:oel="http://schemas.microsoft.com/office/2019/extlst" xmlns:r="http://schemas.openxmlformats.org/officeDocument/2006/relationships" xmlns:m="http://schemas.openxmlformats.org/officeDocument/2006/math" xmlns:v="urn:schemas-microsoft-com:vml" xmlns:wp14="http://schemas.microsoft.com/office/word/2010/wordprocessingDrawing" xmlns:wp="http://schemas.openxmlformats.org/drawingml/2006/wordprocessingDrawing" xmlns:w10="urn:schemas-microsoft-com:office:word" xmlns:w="http://schemas.openxmlformats.org/wordprocessingml/2006/main" xmlns:w14="http://schemas.microsoft.com/office/word/2010/wordml" xmlns:w15="http://schemas.microsoft.com/office/word/2012/wordml" xmlns:w16cex="http://schemas.microsoft.com/office/word/2018/wordml/cex" xmlns:w16cid="http://schemas.microsoft.com/office/word/2016/wordml/cid" xmlns:w16="http://schemas.microsoft.com/office/word/2018/wordml" xmlns:w16sdtdh="http://schemas.microsoft.com/office/word/2020/wordml/sdtdatahash" xmlns:w16se="http://schemas.microsoft.com/office/word/2015/wordml/symex" xmlns:wpg="http://schemas.microsoft.com/office/word/2010/wordprocessingGroup" xmlns:wpi="http://schemas.microsoft.com/office/word/2010/wordprocessingInk" xmlns:wne="http://schemas.microsoft.com/office/word/2006/wordml" xmlns:wps="http://schemas.microsoft.com/office/word/2010/wordprocessingShape" mc:Ignorable="w14 w15 w16se w16cid w16 w16cex w16sdtdh wp14">
+<w:hdr xmlns:wpc="http://schemas.microsoft.com/office/word/2010/wordprocessingCanvas" xmlns:cx="http://schemas.microsoft.com/office/drawing/2014/chartex" xmlns:cx1="http://schemas.microsoft.com/office/drawing/2015/9/8/chartex" xmlns:cx2="http://schemas.microsoft.com/office/drawing/2015/10/21/chartex" xmlns:cx3="http://schemas.microsoft.com/office/drawing/2016/5/9/chartex" xmlns:cx4="http://schemas.microsoft.com/office/drawing/2016/5/10/chartex" xmlns:cx5="http://schemas.microsoft.com/office/drawing/2016/5/11/chartex" xmlns:cx6="http://schemas.microsoft.com/office/drawing/2016/5/12/chartex" xmlns:cx7="http://schemas.microsoft.com/office/drawing/2016/5/13/chartex" xmlns:cx8="http://schemas.microsoft.com/office/drawing/2016/5/14/chartex" xmlns:mc="http://schemas.openxmlformats.org/markup-compatibility/2006" xmlns:aink="http://schemas.microsoft.com/office/drawing/2016/ink" xmlns:am3d="http://schemas.microsoft.com/office/drawing/2017/model3d" xmlns:o="urn:schemas-microsoft-com:office:office" xmlns:oel="http://schemas.microsoft.com/office/2019/extlst" xmlns:r="http://schemas.openxmlformats.org/officeDocument/2006/relationships" xmlns:m="http://schemas.openxmlformats.org/officeDocument/2006/math" xmlns:v="urn:schemas-microsoft-com:vml" xmlns:wp14="http://schemas.microsoft.com/office/word/2010/wordprocessingDrawing" xmlns:wp="http://schemas.openxmlformats.org/drawingml/2006/wordprocessingDrawing" xmlns:w10="urn:schemas-microsoft-com:office:word" xmlns:w="http://schemas.openxmlformats.org/wordprocessingml/2006/main" xmlns:w14="http://schemas.microsoft.com/office/word/2010/wordml" xmlns:w15="http://schemas.microsoft.com/office/word/2012/wordml" xmlns:w16cex="http://schemas.microsoft.com/office/word/2018/wordml/cex" xmlns:w16cid="http://schemas.microsoft.com/office/word/2016/wordml/cid" xmlns:w16="http://schemas.microsoft.com/office/word/2018/wordml" xmlns:w16du="http://schemas.microsoft.com/office/word/2023/wordml/word16du" xmlns:w16sdtdh="http://schemas.microsoft.com/office/word/2020/wordml/sdtdatahash" xmlns:w16sdtfl="http://schemas.microsoft.com/office/word/2024/wordml/sdtformatlock" xmlns:w16se="http://schemas.microsoft.com/office/word/2015/wordml/symex" xmlns:wpg="http://schemas.microsoft.com/office/word/2010/wordprocessingGroup" xmlns:wpi="http://schemas.microsoft.com/office/word/2010/wordprocessingInk" xmlns:wne="http://schemas.microsoft.com/office/word/2006/wordml" xmlns:wps="http://schemas.microsoft.com/office/word/2010/wordprocessingShape" mc:Ignorable="w14 w15 w16se w16cid w16 w16cex w16sdtdh w16sdtfl w16du wp14">
   <w:p>
     <w:pPr>
       <w:pStyle w:val="Header"/>
@@ -1908,7 +1946,7 @@
 </file>
 
 <file path=word/numbering.xml><?xml version="1.0" encoding="utf-8"?>
-<w:numbering xmlns:wpc="http://schemas.microsoft.com/office/word/2010/wordprocessingCanvas" xmlns:cx="http://schemas.microsoft.com/office/drawing/2014/chartex" xmlns:cx1="http://schemas.microsoft.com/office/drawing/2015/9/8/chartex" xmlns:cx2="http://schemas.microsoft.com/office/drawing/2015/10/21/chartex" xmlns:cx3="http://schemas.microsoft.com/office/drawing/2016/5/9/chartex" xmlns:cx4="http://schemas.microsoft.com/office/drawing/2016/5/10/chartex" xmlns:cx5="http://schemas.microsoft.com/office/drawing/2016/5/11/chartex" xmlns:cx6="http://schemas.microsoft.com/office/drawing/2016/5/12/chartex" xmlns:cx7="http://schemas.microsoft.com/office/drawing/2016/5/13/chartex" xmlns:cx8="http://schemas.microsoft.com/office/drawing/2016/5/14/chartex" xmlns:mc="http://schemas.openxmlformats.org/markup-compatibility/2006" xmlns:aink="http://schemas.microsoft.com/office/drawing/2016/ink" xmlns:am3d="http://schemas.microsoft.com/office/drawing/2017/model3d" xmlns:o="urn:schemas-microsoft-com:office:office" xmlns:oel="http://schemas.microsoft.com/office/2019/extlst" xmlns:r="http://schemas.openxmlformats.org/officeDocument/2006/relationships" xmlns:m="http://schemas.openxmlformats.org/officeDocument/2006/math" xmlns:v="urn:schemas-microsoft-com:vml" xmlns:wp14="http://schemas.microsoft.com/office/word/2010/wordprocessingDrawing" xmlns:wp="http://schemas.openxmlformats.org/drawingml/2006/wordprocessingDrawing" xmlns:w10="urn:schemas-microsoft-com:office:word" xmlns:w="http://schemas.openxmlformats.org/wordprocessingml/2006/main" xmlns:w14="http://schemas.microsoft.com/office/word/2010/wordml" xmlns:w15="http://schemas.microsoft.com/office/word/2012/wordml" xmlns:w16cex="http://schemas.microsoft.com/office/word/2018/wordml/cex" xmlns:w16cid="http://schemas.microsoft.com/office/word/2016/wordml/cid" xmlns:w16="http://schemas.microsoft.com/office/word/2018/wordml" xmlns:w16sdtdh="http://schemas.microsoft.com/office/word/2020/wordml/sdtdatahash" xmlns:w16se="http://schemas.microsoft.com/office/word/2015/wordml/symex" xmlns:wpg="http://schemas.microsoft.com/office/word/2010/wordprocessingGroup" xmlns:wpi="http://schemas.microsoft.com/office/word/2010/wordprocessingInk" xmlns:wne="http://schemas.microsoft.com/office/word/2006/wordml" xmlns:wps="http://schemas.microsoft.com/office/word/2010/wordprocessingShape" mc:Ignorable="w14 w15 w16se w16cid w16 w16cex w16sdtdh wp14">
+<w:numbering xmlns:wpc="http://schemas.microsoft.com/office/word/2010/wordprocessingCanvas" xmlns:cx="http://schemas.microsoft.com/office/drawing/2014/chartex" xmlns:cx1="http://schemas.microsoft.com/office/drawing/2015/9/8/chartex" xmlns:cx2="http://schemas.microsoft.com/office/drawing/2015/10/21/chartex" xmlns:cx3="http://schemas.microsoft.com/office/drawing/2016/5/9/chartex" xmlns:cx4="http://schemas.microsoft.com/office/drawing/2016/5/10/chartex" xmlns:cx5="http://schemas.microsoft.com/office/drawing/2016/5/11/chartex" xmlns:cx6="http://schemas.microsoft.com/office/drawing/2016/5/12/chartex" xmlns:cx7="http://schemas.microsoft.com/office/drawing/2016/5/13/chartex" xmlns:cx8="http://schemas.microsoft.com/office/drawing/2016/5/14/chartex" xmlns:mc="http://schemas.openxmlformats.org/markup-compatibility/2006" xmlns:aink="http://schemas.microsoft.com/office/drawing/2016/ink" xmlns:am3d="http://schemas.microsoft.com/office/drawing/2017/model3d" xmlns:o="urn:schemas-microsoft-com:office:office" xmlns:oel="http://schemas.microsoft.com/office/2019/extlst" xmlns:r="http://schemas.openxmlformats.org/officeDocument/2006/relationships" xmlns:m="http://schemas.openxmlformats.org/officeDocument/2006/math" xmlns:v="urn:schemas-microsoft-com:vml" xmlns:wp14="http://schemas.microsoft.com/office/word/2010/wordprocessingDrawing" xmlns:wp="http://schemas.openxmlformats.org/drawingml/2006/wordprocessingDrawing" xmlns:w10="urn:schemas-microsoft-com:office:word" xmlns:w="http://schemas.openxmlformats.org/wordprocessingml/2006/main" xmlns:w14="http://schemas.microsoft.com/office/word/2010/wordml" xmlns:w15="http://schemas.microsoft.com/office/word/2012/wordml" xmlns:w16cex="http://schemas.microsoft.com/office/word/2018/wordml/cex" xmlns:w16cid="http://schemas.microsoft.com/office/word/2016/wordml/cid" xmlns:w16="http://schemas.microsoft.com/office/word/2018/wordml" xmlns:w16du="http://schemas.microsoft.com/office/word/2023/wordml/word16du" xmlns:w16sdtdh="http://schemas.microsoft.com/office/word/2020/wordml/sdtdatahash" xmlns:w16sdtfl="http://schemas.microsoft.com/office/word/2024/wordml/sdtformatlock" xmlns:w16se="http://schemas.microsoft.com/office/word/2015/wordml/symex" xmlns:wpg="http://schemas.microsoft.com/office/word/2010/wordprocessingGroup" xmlns:wpi="http://schemas.microsoft.com/office/word/2010/wordprocessingInk" xmlns:wne="http://schemas.microsoft.com/office/word/2006/wordml" xmlns:wps="http://schemas.microsoft.com/office/word/2010/wordprocessingShape" mc:Ignorable="w14 w15 w16se w16cid w16 w16cex w16sdtdh w16sdtfl w16du wp14">
   <w:abstractNum w:abstractNumId="0" w15:restartNumberingAfterBreak="0">
     <w:nsid w:val="1DB3029D"/>
     <w:multiLevelType w:val="hybridMultilevel"/>
@@ -2118,7 +2156,7 @@
 </file>
 
 <file path=word/styles.xml><?xml version="1.0" encoding="utf-8"?>
-<w:styles xmlns:mc="http://schemas.openxmlformats.org/markup-compatibility/2006" xmlns:r="http://schemas.openxmlformats.org/officeDocument/2006/relationships" xmlns:w="http://schemas.openxmlformats.org/wordprocessingml/2006/main" xmlns:w14="http://schemas.microsoft.com/office/word/2010/wordml" xmlns:w15="http://schemas.microsoft.com/office/word/2012/wordml" xmlns:w16cex="http://schemas.microsoft.com/office/word/2018/wordml/cex" xmlns:w16cid="http://schemas.microsoft.com/office/word/2016/wordml/cid" xmlns:w16="http://schemas.microsoft.com/office/word/2018/wordml" xmlns:w16sdtdh="http://schemas.microsoft.com/office/word/2020/wordml/sdtdatahash" xmlns:w16se="http://schemas.microsoft.com/office/word/2015/wordml/symex" mc:Ignorable="w14 w15 w16se w16cid w16 w16cex w16sdtdh">
+<w:styles xmlns:mc="http://schemas.openxmlformats.org/markup-compatibility/2006" xmlns:r="http://schemas.openxmlformats.org/officeDocument/2006/relationships" xmlns:w="http://schemas.openxmlformats.org/wordprocessingml/2006/main" xmlns:w14="http://schemas.microsoft.com/office/word/2010/wordml" xmlns:w15="http://schemas.microsoft.com/office/word/2012/wordml" xmlns:w16cex="http://schemas.microsoft.com/office/word/2018/wordml/cex" xmlns:w16cid="http://schemas.microsoft.com/office/word/2016/wordml/cid" xmlns:w16="http://schemas.microsoft.com/office/word/2018/wordml" xmlns:w16du="http://schemas.microsoft.com/office/word/2023/wordml/word16du" xmlns:w16sdtdh="http://schemas.microsoft.com/office/word/2020/wordml/sdtdatahash" xmlns:w16sdtfl="http://schemas.microsoft.com/office/word/2024/wordml/sdtformatlock" xmlns:w16se="http://schemas.microsoft.com/office/word/2015/wordml/symex" mc:Ignorable="w14 w15 w16se w16cid w16 w16cex w16sdtdh w16sdtfl w16du">
   <w:docDefaults>
     <w:rPrDefault>
       <w:rPr>

</xml_diff>

<commit_message>
updated Ranked / Risked Threat Report secondary document (ISO/SAE notation in diagrams)
</commit_message>
<xml_diff>
--- a/source/reference_documents/secondary_documents/design phase/Ranked - Risked Threat Report/Ranked - Risked Threat Report.docx
+++ b/source/reference_documents/secondary_documents/design phase/Ranked - Risked Threat Report/Ranked - Risked Threat Report.docx
@@ -26,7 +26,7 @@
         <w:t xml:space="preserve">Version </w:t>
       </w:r>
       <w:r>
-        <w:t>8</w:t>
+        <w:t>9</w:t>
       </w:r>
     </w:p>
     <w:p>
@@ -43,7 +43,7 @@
         <w:rPr>
           <w:noProof/>
         </w:rPr>
-        <w:t>6/16/25 2:46 PM</w:t>
+        <w:t>6/17/25 9:13 AM</w:t>
       </w:r>
       <w:r>
         <w:fldChar w:fldCharType="end"/>
@@ -953,12 +953,27 @@
         <w:t>value</w:t>
       </w:r>
       <w:r>
-        <w:t xml:space="preserve"> (ISO</w:t>
-      </w:r>
-      <w:r>
+        <w:t xml:space="preserve"> (</w:t>
+      </w:r>
+      <w:r>
+        <w:rPr>
+          <w:b/>
+          <w:bCs/>
+        </w:rPr>
+        <w:t>ISO</w:t>
+      </w:r>
+      <w:r>
+        <w:rPr>
+          <w:b/>
+          <w:bCs/>
+        </w:rPr>
         <w:t>/SAE</w:t>
       </w:r>
       <w:r>
+        <w:rPr>
+          <w:b/>
+          <w:bCs/>
+        </w:rPr>
         <w:t xml:space="preserve"> 21434</w:t>
       </w:r>
       <w:r>
@@ -1087,13 +1102,31 @@
         <w:jc w:val="both"/>
       </w:pPr>
       <w:r>
-        <w:t>Quantized value (ISO</w:t>
-      </w:r>
-      <w:r>
+        <w:t>Quantized value (</w:t>
+      </w:r>
+      <w:r>
+        <w:rPr>
+          <w:b/>
+          <w:bCs/>
+        </w:rPr>
+        <w:t>ISO</w:t>
+      </w:r>
+      <w:r>
+        <w:rPr>
+          <w:b/>
+          <w:bCs/>
+        </w:rPr>
         <w:t>/SAE</w:t>
       </w:r>
       <w:r>
-        <w:t xml:space="preserve"> 21434 RQ-15-16: [</w:t>
+        <w:rPr>
+          <w:b/>
+          <w:bCs/>
+        </w:rPr>
+        <w:t xml:space="preserve"> 21434</w:t>
+      </w:r>
+      <w:r>
+        <w:t xml:space="preserve"> RQ-15-16: [</w:t>
       </w:r>
       <w:r>
         <w:rPr>
@@ -1261,10 +1294,10 @@
           <w:noProof/>
         </w:rPr>
         <w:drawing>
-          <wp:inline distT="0" distB="0" distL="0" distR="0" wp14:anchorId="2F2D7CF7" wp14:editId="6967DAE3">
-            <wp:extent cx="5943600" cy="1029970"/>
-            <wp:effectExtent l="0" t="0" r="0" b="0"/>
-            <wp:docPr id="2" name="Picture 2" descr="Table&#10;&#10;Description automatically generated"/>
+          <wp:inline distT="0" distB="0" distL="0" distR="0" wp14:anchorId="2F2D7CF7" wp14:editId="043B5021">
+            <wp:extent cx="5943600" cy="875413"/>
+            <wp:effectExtent l="0" t="0" r="0" b="1270"/>
+            <wp:docPr id="2" name="Picture 2"/>
             <wp:cNvGraphicFramePr>
               <a:graphicFrameLocks xmlns:a="http://schemas.openxmlformats.org/drawingml/2006/main" noChangeAspect="1"/>
             </wp:cNvGraphicFramePr>
@@ -1272,11 +1305,11 @@
               <a:graphicData uri="http://schemas.openxmlformats.org/drawingml/2006/picture">
                 <pic:pic xmlns:pic="http://schemas.openxmlformats.org/drawingml/2006/picture">
                   <pic:nvPicPr>
-                    <pic:cNvPr id="2" name="Picture 2" descr="Table&#10;&#10;Description automatically generated"/>
+                    <pic:cNvPr id="2" name="Picture 2"/>
                     <pic:cNvPicPr/>
                   </pic:nvPicPr>
                   <pic:blipFill>
-                    <a:blip r:embed="rId9">
+                    <a:blip r:embed="rId9" cstate="print">
                       <a:extLst>
                         <a:ext uri="{28A0092B-C50C-407E-A947-70E740481C1C}">
                           <a14:useLocalDpi xmlns:a14="http://schemas.microsoft.com/office/drawing/2010/main" val="0"/>
@@ -1290,7 +1323,7 @@
                   <pic:spPr>
                     <a:xfrm>
                       <a:off x="0" y="0"/>
-                      <a:ext cx="5943600" cy="1029970"/>
+                      <a:ext cx="5943600" cy="875413"/>
                     </a:xfrm>
                     <a:prstGeom prst="rect">
                       <a:avLst/>
@@ -1353,7 +1386,34 @@
         <w:t>[8]</w:t>
       </w:r>
       <w:r>
-        <w:t xml:space="preserve"> and </w:t>
+        <w:t xml:space="preserve"> </w:t>
+      </w:r>
+      <w:r>
+        <w:rPr>
+          <w:b/>
+          <w:bCs/>
+        </w:rPr>
+        <w:t>ISO</w:t>
+      </w:r>
+      <w:r>
+        <w:rPr>
+          <w:b/>
+          <w:bCs/>
+        </w:rPr>
+        <w:t>/SAE</w:t>
+      </w:r>
+      <w:r>
+        <w:rPr>
+          <w:b/>
+          <w:bCs/>
+        </w:rPr>
+        <w:t xml:space="preserve"> 21434</w:t>
+      </w:r>
+      <w:r>
+        <w:t xml:space="preserve">, </w:t>
+      </w:r>
+      <w:r>
+        <w:t xml:space="preserve">and </w:t>
       </w:r>
       <w:r>
         <w:rPr>
@@ -1390,9 +1450,9 @@
           <w:noProof/>
         </w:rPr>
         <w:drawing>
-          <wp:inline distT="0" distB="0" distL="0" distR="0" wp14:anchorId="23260CD7" wp14:editId="6C203A97">
-            <wp:extent cx="5943600" cy="2162907"/>
-            <wp:effectExtent l="0" t="0" r="0" b="0"/>
+          <wp:inline distT="0" distB="0" distL="0" distR="0" wp14:anchorId="23260CD7" wp14:editId="627D83EF">
+            <wp:extent cx="5943598" cy="2162907"/>
+            <wp:effectExtent l="0" t="0" r="635" b="0"/>
             <wp:docPr id="3" name="Picture 3"/>
             <wp:cNvGraphicFramePr>
               <a:graphicFrameLocks xmlns:a="http://schemas.openxmlformats.org/drawingml/2006/main" noChangeAspect="1"/>
@@ -1405,7 +1465,7 @@
                     <pic:cNvPicPr/>
                   </pic:nvPicPr>
                   <pic:blipFill>
-                    <a:blip r:embed="rId10">
+                    <a:blip r:embed="rId10" cstate="print">
                       <a:extLst>
                         <a:ext uri="{28A0092B-C50C-407E-A947-70E740481C1C}">
                           <a14:useLocalDpi xmlns:a14="http://schemas.microsoft.com/office/drawing/2010/main" val="0"/>
@@ -1419,7 +1479,7 @@
                   <pic:spPr>
                     <a:xfrm>
                       <a:off x="0" y="0"/>
-                      <a:ext cx="5943600" cy="2162907"/>
+                      <a:ext cx="5943598" cy="2162907"/>
                     </a:xfrm>
                     <a:prstGeom prst="rect">
                       <a:avLst/>

</xml_diff>

<commit_message>
Updated Ranked / Risked Threat Report AVCDL secondary document (overly restrictive reference to input source)
</commit_message>
<xml_diff>
--- a/source/reference_documents/secondary_documents/design phase/Ranked - Risked Threat Report/Ranked - Risked Threat Report.docx
+++ b/source/reference_documents/secondary_documents/design phase/Ranked - Risked Threat Report/Ranked - Risked Threat Report.docx
@@ -26,7 +26,7 @@
         <w:t xml:space="preserve">Version </w:t>
       </w:r>
       <w:r>
-        <w:t>9</w:t>
+        <w:t>10</w:t>
       </w:r>
     </w:p>
     <w:p>
@@ -43,7 +43,7 @@
         <w:rPr>
           <w:noProof/>
         </w:rPr>
-        <w:t>6/17/25 9:13 AM</w:t>
+        <w:t>4/6/26 10:39 AM</w:t>
       </w:r>
       <w:r>
         <w:fldChar w:fldCharType="end"/>
@@ -206,45 +206,7 @@
         <w:t xml:space="preserve">in order to properly assess the disposition of these candidates and required </w:t>
       </w:r>
       <w:r>
-        <w:t xml:space="preserve">given the nature of safety-critical, cyber-physical systems, subject to certifications such as </w:t>
-      </w:r>
-      <w:r>
-        <w:rPr>
-          <w:b/>
-          <w:bCs/>
-        </w:rPr>
-        <w:t>ISO</w:t>
-      </w:r>
-      <w:r>
-        <w:rPr>
-          <w:b/>
-          <w:bCs/>
-        </w:rPr>
-        <w:t>/SAE</w:t>
-      </w:r>
-      <w:r>
-        <w:rPr>
-          <w:b/>
-          <w:bCs/>
-        </w:rPr>
-        <w:t xml:space="preserve"> 21434</w:t>
-      </w:r>
-      <w:r>
-        <w:t xml:space="preserve"> and </w:t>
-      </w:r>
-      <w:r>
-        <w:rPr>
-          <w:b/>
-          <w:bCs/>
-        </w:rPr>
-        <w:t xml:space="preserve">ISO </w:t>
-      </w:r>
-      <w:r>
-        <w:rPr>
-          <w:b/>
-          <w:bCs/>
-        </w:rPr>
-        <w:t>26262</w:t>
+        <w:t>given the nature of safety-critical, cyber-physical systems</w:t>
       </w:r>
       <w:r>
         <w:t>.</w:t>
@@ -402,7 +364,58 @@
         <w:jc w:val="both"/>
       </w:pPr>
       <w:r>
-        <w:t>The ranked / risked threat report summarizes the analysis performed on the output of the threat modeling activity which provides input into the threat candidate slicing activity. As indicated by the title, there are two discrete operations which take place. The first is the ranking of threat candidates to determine their relative severity. The second is the risking of threats to determine their potential harm.</w:t>
+        <w:t xml:space="preserve">The ranked / risked threat report summarizes the analysis performed on the output of </w:t>
+      </w:r>
+      <w:r>
+        <w:t xml:space="preserve">various </w:t>
+      </w:r>
+      <w:r>
+        <w:t>activit</w:t>
+      </w:r>
+      <w:r>
+        <w:t xml:space="preserve">ies </w:t>
+      </w:r>
+      <w:r>
+        <w:rPr>
+          <w:b/>
+          <w:bCs/>
+          <w:color w:val="0070C0"/>
+          <w:vertAlign w:val="superscript"/>
+        </w:rPr>
+        <w:t>[2, 3, 5</w:t>
+      </w:r>
+      <w:r>
+        <w:rPr>
+          <w:b/>
+          <w:bCs/>
+          <w:color w:val="0070C0"/>
+          <w:vertAlign w:val="superscript"/>
+        </w:rPr>
+        <w:t>, 10, 11</w:t>
+      </w:r>
+      <w:r>
+        <w:rPr>
+          <w:b/>
+          <w:bCs/>
+          <w:color w:val="0070C0"/>
+          <w:vertAlign w:val="superscript"/>
+        </w:rPr>
+        <w:t>]</w:t>
+      </w:r>
+      <w:r>
+        <w:t xml:space="preserve"> which </w:t>
+      </w:r>
+      <w:r>
+        <w:t>generate</w:t>
+      </w:r>
+      <w:r>
+        <w:t xml:space="preserve"> the threat candidate</w:t>
+      </w:r>
+      <w:r>
+        <w:t>s</w:t>
+      </w:r>
+      <w:r>
+        <w:t>. As indicated by the title, there are two discrete operations which take place. The first is the ranking of threat candidates to determine their relative severity. The second is the risking of threats to determine their potential harm.</w:t>
       </w:r>
     </w:p>
     <w:p>
@@ -1805,6 +1818,68 @@
           <w:lang w:val="en-US"/>
         </w:rPr>
         <w:t xml:space="preserve"> </w:t>
+      </w:r>
+    </w:p>
+    <w:p>
+      <w:pPr>
+        <w:pStyle w:val="ListParagraph"/>
+        <w:numPr>
+          <w:ilvl w:val="0"/>
+          <w:numId w:val="1"/>
+        </w:numPr>
+        <w:rPr>
+          <w:b/>
+          <w:bCs/>
+          <w:lang w:val="en-US"/>
+        </w:rPr>
+      </w:pPr>
+      <w:r>
+        <w:rPr>
+          <w:b/>
+          <w:bCs/>
+        </w:rPr>
+        <w:t>Static</w:t>
+      </w:r>
+      <w:r>
+        <w:rPr>
+          <w:b/>
+          <w:bCs/>
+        </w:rPr>
+        <w:t xml:space="preserve"> Analysis Report</w:t>
+      </w:r>
+      <w:r>
+        <w:t xml:space="preserve"> (AVCDL secondary document)</w:t>
+      </w:r>
+    </w:p>
+    <w:p>
+      <w:pPr>
+        <w:pStyle w:val="ListParagraph"/>
+        <w:numPr>
+          <w:ilvl w:val="0"/>
+          <w:numId w:val="1"/>
+        </w:numPr>
+        <w:rPr>
+          <w:b/>
+          <w:bCs/>
+          <w:lang w:val="en-US"/>
+        </w:rPr>
+      </w:pPr>
+      <w:r>
+        <w:rPr>
+          <w:b/>
+          <w:bCs/>
+        </w:rPr>
+        <w:t>Dynamic</w:t>
+      </w:r>
+      <w:r>
+        <w:rPr>
+          <w:b/>
+          <w:bCs/>
+        </w:rPr>
+        <w:t xml:space="preserve"> Analysis Report</w:t>
+      </w:r>
+      <w:r>
+        <w:t xml:space="preserve"> (AVCDL secondary document)</w:t>
       </w:r>
     </w:p>
     <w:sectPr>

</xml_diff>